<commit_message>
fix(sanitizer): add contact-line fallback rule; integrate into parse_docx()
Rule 2 strips short converted-icon runs (1-2 non-whitespace chars in Latin
Ext-A/B or PUA range) when the paragraph has no explicit body font and the
following text matches a contact pattern.  This catches artifacts in template
DOCX files that pre-date pdf_to_docx() sanitization (sample 35 contact block).

parse_docx() now calls sanitize_docx_artifacts() before loading the Document
so every template — freshly converted or pre-existing — is cleaned before
the parser reads it.

Co-Authored-By: Claude Sonnet 4.6 <noreply@anthropic.com>
</commit_message>
<xml_diff>
--- a/tests/samples/resume/docx/35-Gleb_Zernov_Resume.docx
+++ b/tests/samples/resume/docx/35-Gleb_Zernov_Resume.docx
@@ -178,7 +178,6 @@
           <w:spacing w:val="-4"/>
           <w:sz w:val="20"/>
         </w:rPr>
-        <w:t>ć</w:t>
       </w:r>
       <w:r>
         <w:rPr>
@@ -186,7 +185,6 @@
           <w:spacing w:val="-8"/>
           <w:sz w:val="20"/>
         </w:rPr>
-        <w:t> </w:t>
       </w:r>
       <w:hyperlink r:id="rId5">
         <w:r>
@@ -215,7 +213,6 @@
           <w:w w:val="155"/>
           <w:sz w:val="20"/>
         </w:rPr>
-        <w:t>ć</w:t>
       </w:r>
       <w:r>
         <w:rPr>
@@ -224,7 +221,6 @@
           <w:w w:val="155"/>
           <w:sz w:val="20"/>
         </w:rPr>
-        <w:t> </w:t>
       </w:r>
       <w:hyperlink r:id="rId6">
         <w:r>
@@ -251,7 +247,6 @@
           <w:rFonts w:ascii="Times New Roman" w:hAnsi="Times New Roman"/>
           <w:sz w:val="20"/>
         </w:rPr>
-        <w:t>Ħ </w:t>
       </w:r>
       <w:r>
         <w:rPr>

</xml_diff>